<commit_message>
Labs 2-5: add 'If something goes wrong' tables (Gaurav's feedback)
Gaurav needed time for basic troubleshooting, so Labs 2-5 now have a
problem/fix table like Lab 1.
</commit_message>
<xml_diff>
--- a/project-docs/05-student-lab-handouts/DSYS601 Lab2 Deploy the demo app.docx
+++ b/project-docs/05-student-lab-handouts/DSYS601 Lab2 Deploy the demo app.docx
@@ -6966,6 +6966,457 @@
         <w:spacing w:after="60"/>
       </w:pPr>
     </w:p>
+    <w:p xmlns:wp14="http://schemas.microsoft.com/office/word/2010/wordml" wp14:textId="77777777">
+      <w:pPr>
+        <w:pStyle w:val="Heading1"/>
+      </w:pPr>
+      <w:r>
+        <w:t xml:space="preserve">If something goes wrong</w:t>
+      </w:r>
+    </w:p>
+    <w:tbl>
+      <w:tblPr>
+        <w:tblW w:w="9638" w:type="dxa"/>
+        <w:tblBorders>
+          <w:top w:val="single" w:color="auto" w:sz="4"/>
+          <w:left w:val="single" w:color="auto" w:sz="4"/>
+          <w:bottom w:val="single" w:color="auto" w:sz="4"/>
+          <w:right w:val="single" w:color="auto" w:sz="4"/>
+          <w:insideH w:val="single" w:color="auto" w:sz="4"/>
+          <w:insideV w:val="single" w:color="auto" w:sz="4"/>
+        </w:tblBorders>
+        <w:tblLayout w:type="fixed"/>
+      </w:tblPr>
+      <w:tblGrid>
+        <w:gridCol w:w="3300"/>
+        <w:gridCol w:w="6338"/>
+      </w:tblGrid>
+      <w:tr xmlns:wp14="http://schemas.microsoft.com/office/word/2010/wordml" wp14:textId="77777777">
+        <w:trPr>
+          <w:tblHeader/>
+        </w:trPr>
+        <w:tc>
+          <w:tcPr>
+            <w:tcW w:w="3300" w:type="dxa"/>
+            <w:tcBorders>
+              <w:top w:val="single" w:color="BFBFBF" w:sz="4"/>
+              <w:left w:val="single" w:color="BFBFBF" w:sz="4"/>
+              <w:bottom w:val="single" w:color="BFBFBF" w:sz="4"/>
+              <w:right w:val="single" w:color="BFBFBF" w:sz="4"/>
+            </w:tcBorders>
+            <w:shd w:val="clear" w:color="auto" w:fill="1F3864"/>
+            <w:tcMar>
+              <w:top w:w="60" w:type="dxa"/>
+              <w:left w:w="110" w:type="dxa"/>
+              <w:bottom w:w="60" w:type="dxa"/>
+              <w:right w:w="110" w:type="dxa"/>
+            </w:tcMar>
+          </w:tcPr>
+          <w:p wp14:textId="77777777">
+            <w:r>
+              <w:rPr>
+                <w:b/>
+                <w:bCs/>
+                <w:color w:val="FFFFFF"/>
+              </w:rPr>
+              <w:t xml:space="preserve">Problem</w:t>
+            </w:r>
+          </w:p>
+        </w:tc>
+        <w:tc>
+          <w:tcPr>
+            <w:tcW w:w="6338" w:type="dxa"/>
+            <w:tcBorders>
+              <w:top w:val="single" w:color="BFBFBF" w:sz="4"/>
+              <w:left w:val="single" w:color="BFBFBF" w:sz="4"/>
+              <w:bottom w:val="single" w:color="BFBFBF" w:sz="4"/>
+              <w:right w:val="single" w:color="BFBFBF" w:sz="4"/>
+            </w:tcBorders>
+            <w:shd w:val="clear" w:color="auto" w:fill="1F3864"/>
+            <w:tcMar>
+              <w:top w:w="60" w:type="dxa"/>
+              <w:left w:w="110" w:type="dxa"/>
+              <w:bottom w:w="60" w:type="dxa"/>
+              <w:right w:w="110" w:type="dxa"/>
+            </w:tcMar>
+          </w:tcPr>
+          <w:p wp14:textId="77777777">
+            <w:r>
+              <w:rPr>
+                <w:b/>
+                <w:bCs/>
+                <w:color w:val="FFFFFF"/>
+              </w:rPr>
+              <w:t xml:space="preserve">Fix</w:t>
+            </w:r>
+          </w:p>
+        </w:tc>
+      </w:tr>
+      <w:tr xmlns:wp14="http://schemas.microsoft.com/office/word/2010/wordml" wp14:textId="77777777">
+        <w:trPr>
+          <w:cantSplit/>
+        </w:trPr>
+        <w:tc>
+          <w:tcPr>
+            <w:tcW w:w="3300" w:type="dxa"/>
+            <w:tcBorders>
+              <w:top w:val="single" w:color="BFBFBF" w:sz="4"/>
+              <w:left w:val="single" w:color="BFBFBF" w:sz="4"/>
+              <w:bottom w:val="single" w:color="BFBFBF" w:sz="4"/>
+              <w:right w:val="single" w:color="BFBFBF" w:sz="4"/>
+            </w:tcBorders>
+            <w:tcMar>
+              <w:top w:w="60" w:type="dxa"/>
+              <w:left w:w="110" w:type="dxa"/>
+              <w:bottom w:w="60" w:type="dxa"/>
+              <w:right w:w="110" w:type="dxa"/>
+            </w:tcMar>
+          </w:tcPr>
+          <w:p wp14:textId="77777777">
+            <w:r>
+              <w:t xml:space="preserve">Unable to connect to the server, or connection refused from kubectl</w:t>
+            </w:r>
+          </w:p>
+        </w:tc>
+        <w:tc>
+          <w:tcPr>
+            <w:tcW w:w="6338" w:type="dxa"/>
+            <w:tcBorders>
+              <w:top w:val="single" w:color="BFBFBF" w:sz="4"/>
+              <w:left w:val="single" w:color="BFBFBF" w:sz="4"/>
+              <w:bottom w:val="single" w:color="BFBFBF" w:sz="4"/>
+              <w:right w:val="single" w:color="BFBFBF" w:sz="4"/>
+            </w:tcBorders>
+            <w:tcMar>
+              <w:top w:w="60" w:type="dxa"/>
+              <w:left w:w="110" w:type="dxa"/>
+              <w:bottom w:w="60" w:type="dxa"/>
+              <w:right w:w="110" w:type="dxa"/>
+            </w:tcMar>
+          </w:tcPr>
+          <w:p wp14:textId="77777777">
+            <w:r>
+              <w:rPr>
+                <w:lang w:val="en-US"/>
+              </w:rPr>
+              <w:t xml:space="preserve">The cluster is not running. Check with docker ps. If no nodes are listed, rebuild it (Step 3).</w:t>
+            </w:r>
+          </w:p>
+        </w:tc>
+      </w:tr>
+      <w:tr xmlns:wp14="http://schemas.microsoft.com/office/word/2010/wordml" wp14:textId="77777777">
+        <w:trPr>
+          <w:cantSplit/>
+        </w:trPr>
+        <w:tc>
+          <w:tcPr>
+            <w:tcW w:w="3300" w:type="dxa"/>
+            <w:tcBorders>
+              <w:top w:val="single" w:color="BFBFBF" w:sz="4"/>
+              <w:left w:val="single" w:color="BFBFBF" w:sz="4"/>
+              <w:bottom w:val="single" w:color="BFBFBF" w:sz="4"/>
+              <w:right w:val="single" w:color="BFBFBF" w:sz="4"/>
+            </w:tcBorders>
+            <w:tcMar>
+              <w:top w:w="60" w:type="dxa"/>
+              <w:left w:w="110" w:type="dxa"/>
+              <w:bottom w:w="60" w:type="dxa"/>
+              <w:right w:w="110" w:type="dxa"/>
+            </w:tcMar>
+          </w:tcPr>
+          <w:p wp14:textId="77777777">
+            <w:r>
+              <w:t xml:space="preserve">Pods stuck in Pending or ContainerCreating</w:t>
+            </w:r>
+          </w:p>
+        </w:tc>
+        <w:tc>
+          <w:tcPr>
+            <w:tcW w:w="6338" w:type="dxa"/>
+            <w:tcBorders>
+              <w:top w:val="single" w:color="BFBFBF" w:sz="4"/>
+              <w:left w:val="single" w:color="BFBFBF" w:sz="4"/>
+              <w:bottom w:val="single" w:color="BFBFBF" w:sz="4"/>
+              <w:right w:val="single" w:color="BFBFBF" w:sz="4"/>
+            </w:tcBorders>
+            <w:tcMar>
+              <w:top w:w="60" w:type="dxa"/>
+              <w:left w:w="110" w:type="dxa"/>
+              <w:bottom w:w="60" w:type="dxa"/>
+              <w:right w:w="110" w:type="dxa"/>
+            </w:tcMar>
+          </w:tcPr>
+          <w:p wp14:textId="77777777">
+            <w:r>
+              <w:rPr>
+                <w:lang w:val="en-US"/>
+              </w:rPr>
+              <w:t xml:space="preserve">The images are still downloading. Wait a minute and check again. If it lasts more than 5 minutes, run kubectl describe pod &lt;name&gt; -n demo-app and read the Events.</w:t>
+            </w:r>
+          </w:p>
+        </w:tc>
+      </w:tr>
+      <w:tr xmlns:wp14="http://schemas.microsoft.com/office/word/2010/wordml" wp14:textId="77777777">
+        <w:trPr>
+          <w:cantSplit/>
+        </w:trPr>
+        <w:tc>
+          <w:tcPr>
+            <w:tcW w:w="3300" w:type="dxa"/>
+            <w:tcBorders>
+              <w:top w:val="single" w:color="BFBFBF" w:sz="4"/>
+              <w:left w:val="single" w:color="BFBFBF" w:sz="4"/>
+              <w:bottom w:val="single" w:color="BFBFBF" w:sz="4"/>
+              <w:right w:val="single" w:color="BFBFBF" w:sz="4"/>
+            </w:tcBorders>
+            <w:tcMar>
+              <w:top w:w="60" w:type="dxa"/>
+              <w:left w:w="110" w:type="dxa"/>
+              <w:bottom w:w="60" w:type="dxa"/>
+              <w:right w:w="110" w:type="dxa"/>
+            </w:tcMar>
+          </w:tcPr>
+          <w:p wp14:textId="77777777">
+            <w:r>
+              <w:t xml:space="preserve">curl: connection refused</w:t>
+            </w:r>
+          </w:p>
+        </w:tc>
+        <w:tc>
+          <w:tcPr>
+            <w:tcW w:w="6338" w:type="dxa"/>
+            <w:tcBorders>
+              <w:top w:val="single" w:color="BFBFBF" w:sz="4"/>
+              <w:left w:val="single" w:color="BFBFBF" w:sz="4"/>
+              <w:bottom w:val="single" w:color="BFBFBF" w:sz="4"/>
+              <w:right w:val="single" w:color="BFBFBF" w:sz="4"/>
+            </w:tcBorders>
+            <w:tcMar>
+              <w:top w:w="60" w:type="dxa"/>
+              <w:left w:w="110" w:type="dxa"/>
+              <w:bottom w:w="60" w:type="dxa"/>
+              <w:right w:w="110" w:type="dxa"/>
+            </w:tcMar>
+          </w:tcPr>
+          <w:p wp14:textId="77777777">
+            <w:r>
+              <w:rPr>
+                <w:lang w:val="en-US"/>
+              </w:rPr>
+              <w:t xml:space="preserve">The port-forward in tab 2 or tab 3 has stopped. Run it again (Up arrow, Enter).</w:t>
+            </w:r>
+          </w:p>
+        </w:tc>
+      </w:tr>
+      <w:tr xmlns:wp14="http://schemas.microsoft.com/office/word/2010/wordml" wp14:textId="77777777">
+        <w:trPr>
+          <w:cantSplit/>
+        </w:trPr>
+        <w:tc>
+          <w:tcPr>
+            <w:tcW w:w="3300" w:type="dxa"/>
+            <w:tcBorders>
+              <w:top w:val="single" w:color="BFBFBF" w:sz="4"/>
+              <w:left w:val="single" w:color="BFBFBF" w:sz="4"/>
+              <w:bottom w:val="single" w:color="BFBFBF" w:sz="4"/>
+              <w:right w:val="single" w:color="BFBFBF" w:sz="4"/>
+            </w:tcBorders>
+            <w:tcMar>
+              <w:top w:w="60" w:type="dxa"/>
+              <w:left w:w="110" w:type="dxa"/>
+              <w:bottom w:w="60" w:type="dxa"/>
+              <w:right w:w="110" w:type="dxa"/>
+            </w:tcMar>
+          </w:tcPr>
+          <w:p wp14:textId="77777777">
+            <w:r>
+              <w:t xml:space="preserve">{"error": "cannot reach redis"}</w:t>
+            </w:r>
+          </w:p>
+        </w:tc>
+        <w:tc>
+          <w:tcPr>
+            <w:tcW w:w="6338" w:type="dxa"/>
+            <w:tcBorders>
+              <w:top w:val="single" w:color="BFBFBF" w:sz="4"/>
+              <w:left w:val="single" w:color="BFBFBF" w:sz="4"/>
+              <w:bottom w:val="single" w:color="BFBFBF" w:sz="4"/>
+              <w:right w:val="single" w:color="BFBFBF" w:sz="4"/>
+            </w:tcBorders>
+            <w:tcMar>
+              <w:top w:w="60" w:type="dxa"/>
+              <w:left w:w="110" w:type="dxa"/>
+              <w:bottom w:w="60" w:type="dxa"/>
+              <w:right w:w="110" w:type="dxa"/>
+            </w:tcMar>
+          </w:tcPr>
+          <w:p wp14:textId="77777777">
+            <w:r>
+              <w:rPr>
+                <w:lang w:val="en-US"/>
+              </w:rPr>
+              <w:t xml:space="preserve">The redis pod is not Running yet. Check with kubectl get pods -n demo-app -l app=redis, wait, then try again.</w:t>
+            </w:r>
+          </w:p>
+        </w:tc>
+      </w:tr>
+      <w:tr xmlns:wp14="http://schemas.microsoft.com/office/word/2010/wordml" wp14:textId="77777777">
+        <w:trPr>
+          <w:cantSplit/>
+        </w:trPr>
+        <w:tc>
+          <w:tcPr>
+            <w:tcW w:w="3300" w:type="dxa"/>
+            <w:tcBorders>
+              <w:top w:val="single" w:color="BFBFBF" w:sz="4"/>
+              <w:left w:val="single" w:color="BFBFBF" w:sz="4"/>
+              <w:bottom w:val="single" w:color="BFBFBF" w:sz="4"/>
+              <w:right w:val="single" w:color="BFBFBF" w:sz="4"/>
+            </w:tcBorders>
+            <w:tcMar>
+              <w:top w:w="60" w:type="dxa"/>
+              <w:left w:w="110" w:type="dxa"/>
+              <w:bottom w:w="60" w:type="dxa"/>
+              <w:right w:w="110" w:type="dxa"/>
+            </w:tcMar>
+          </w:tcPr>
+          <w:p wp14:textId="77777777">
+            <w:r>
+              <w:t xml:space="preserve">address already in use</w:t>
+            </w:r>
+          </w:p>
+        </w:tc>
+        <w:tc>
+          <w:tcPr>
+            <w:tcW w:w="6338" w:type="dxa"/>
+            <w:tcBorders>
+              <w:top w:val="single" w:color="BFBFBF" w:sz="4"/>
+              <w:left w:val="single" w:color="BFBFBF" w:sz="4"/>
+              <w:bottom w:val="single" w:color="BFBFBF" w:sz="4"/>
+              <w:right w:val="single" w:color="BFBFBF" w:sz="4"/>
+            </w:tcBorders>
+            <w:tcMar>
+              <w:top w:w="60" w:type="dxa"/>
+              <w:left w:w="110" w:type="dxa"/>
+              <w:bottom w:w="60" w:type="dxa"/>
+              <w:right w:w="110" w:type="dxa"/>
+            </w:tcMar>
+          </w:tcPr>
+          <w:p wp14:textId="77777777">
+            <w:r>
+              <w:rPr>
+                <w:lang w:val="en-US"/>
+              </w:rPr>
+              <w:t xml:space="preserve">That port-forward is already running in another tab.</w:t>
+            </w:r>
+          </w:p>
+        </w:tc>
+      </w:tr>
+      <w:tr xmlns:wp14="http://schemas.microsoft.com/office/word/2010/wordml" wp14:textId="77777777">
+        <w:trPr>
+          <w:cantSplit/>
+        </w:trPr>
+        <w:tc>
+          <w:tcPr>
+            <w:tcW w:w="3300" w:type="dxa"/>
+            <w:tcBorders>
+              <w:top w:val="single" w:color="BFBFBF" w:sz="4"/>
+              <w:left w:val="single" w:color="BFBFBF" w:sz="4"/>
+              <w:bottom w:val="single" w:color="BFBFBF" w:sz="4"/>
+              <w:right w:val="single" w:color="BFBFBF" w:sz="4"/>
+            </w:tcBorders>
+            <w:tcMar>
+              <w:top w:w="60" w:type="dxa"/>
+              <w:left w:w="110" w:type="dxa"/>
+              <w:bottom w:w="60" w:type="dxa"/>
+              <w:right w:w="110" w:type="dxa"/>
+            </w:tcMar>
+          </w:tcPr>
+          <w:p wp14:textId="77777777">
+            <w:r>
+              <w:t xml:space="preserve">Error from server (NotFound) when deleting a pod</w:t>
+            </w:r>
+          </w:p>
+        </w:tc>
+        <w:tc>
+          <w:tcPr>
+            <w:tcW w:w="6338" w:type="dxa"/>
+            <w:tcBorders>
+              <w:top w:val="single" w:color="BFBFBF" w:sz="4"/>
+              <w:left w:val="single" w:color="BFBFBF" w:sz="4"/>
+              <w:bottom w:val="single" w:color="BFBFBF" w:sz="4"/>
+              <w:right w:val="single" w:color="BFBFBF" w:sz="4"/>
+            </w:tcBorders>
+            <w:tcMar>
+              <w:top w:w="60" w:type="dxa"/>
+              <w:left w:w="110" w:type="dxa"/>
+              <w:bottom w:w="60" w:type="dxa"/>
+              <w:right w:w="110" w:type="dxa"/>
+            </w:tcMar>
+          </w:tcPr>
+          <w:p wp14:textId="77777777">
+            <w:r>
+              <w:rPr>
+                <w:lang w:val="en-US"/>
+              </w:rPr>
+              <w:t xml:space="preserve">The name is not one of yours. Copy a name from kubectl get pods -n demo-app.</w:t>
+            </w:r>
+          </w:p>
+        </w:tc>
+      </w:tr>
+      <w:tr xmlns:wp14="http://schemas.microsoft.com/office/word/2010/wordml" wp14:textId="77777777">
+        <w:trPr>
+          <w:cantSplit/>
+        </w:trPr>
+        <w:tc>
+          <w:tcPr>
+            <w:tcW w:w="3300" w:type="dxa"/>
+            <w:tcBorders>
+              <w:top w:val="single" w:color="BFBFBF" w:sz="4"/>
+              <w:left w:val="single" w:color="BFBFBF" w:sz="4"/>
+              <w:bottom w:val="single" w:color="BFBFBF" w:sz="4"/>
+              <w:right w:val="single" w:color="BFBFBF" w:sz="4"/>
+            </w:tcBorders>
+            <w:tcMar>
+              <w:top w:w="60" w:type="dxa"/>
+              <w:left w:w="110" w:type="dxa"/>
+              <w:bottom w:w="60" w:type="dxa"/>
+              <w:right w:w="110" w:type="dxa"/>
+            </w:tcMar>
+          </w:tcPr>
+          <w:p wp14:textId="77777777">
+            <w:r>
+              <w:t xml:space="preserve">An error after redis-cli shutdown (Step 26)</w:t>
+            </w:r>
+          </w:p>
+        </w:tc>
+        <w:tc>
+          <w:tcPr>
+            <w:tcW w:w="6338" w:type="dxa"/>
+            <w:tcBorders>
+              <w:top w:val="single" w:color="BFBFBF" w:sz="4"/>
+              <w:left w:val="single" w:color="BFBFBF" w:sz="4"/>
+              <w:bottom w:val="single" w:color="BFBFBF" w:sz="4"/>
+              <w:right w:val="single" w:color="BFBFBF" w:sz="4"/>
+            </w:tcBorders>
+            <w:tcMar>
+              <w:top w:w="60" w:type="dxa"/>
+              <w:left w:w="110" w:type="dxa"/>
+              <w:bottom w:w="60" w:type="dxa"/>
+              <w:right w:w="110" w:type="dxa"/>
+            </w:tcMar>
+          </w:tcPr>
+          <w:p wp14:textId="77777777">
+            <w:r>
+              <w:rPr>
+                <w:lang w:val="en-US"/>
+              </w:rPr>
+              <w:t xml:space="preserve">This is expected: Redis stopped. Wait until RESTARTS shows 1, then carry on.</w:t>
+            </w:r>
+          </w:p>
+        </w:tc>
+      </w:tr>
+    </w:tbl>
     <w:p xmlns:wp14="http://schemas.microsoft.com/office/word/2010/wordml" wp14:textId="77777777">
       <w:pPr>
         <w:pStyle w:val="Heading1"/>

</xml_diff>